<commit_message>
docs: migrate user manual to LaTeX and update for Autocorrelation and g2 (#115)
Updated the user manual to LaTeX including new sections for Autocorrelation and g2 tabs. Additionally, fixed and adjusted window sizes for data and plot saving dialogs in both G2 and Autocorrelation views.
</commit_message>
<xml_diff>
--- a/docs/tempicoSoftwareUserManual/Tausand Tempico Software Manual 2.1.0.docx
+++ b/docs/tempicoSoftwareUserManual/Tausand Tempico Software Manual 2.1.0.docx
@@ -188,7 +188,7 @@
         <w:t>Rev 1.</w:t>
       </w:r>
       <w:r>
-        <w:t>4</w:t>
+        <w:t>5</w:t>
       </w:r>
     </w:p>
     <w:p>
@@ -197,13 +197,19 @@
         <w:jc w:val="center"/>
       </w:pPr>
       <w:r>
-        <w:t>March 31</w:t>
+        <w:t>August</w:t>
+      </w:r>
+      <w:r>
+        <w:t xml:space="preserve"> </w:t>
+      </w:r>
+      <w:r>
+        <w:t>8</w:t>
       </w:r>
       <w:r>
         <w:rPr>
           <w:vertAlign w:val="superscript"/>
         </w:rPr>
-        <w:t>st</w:t>
+        <w:t>th</w:t>
       </w:r>
       <w:r>
         <w:t>, 202</w:t>
@@ -18307,6 +18313,7 @@
         <w:rPr>
           <w:rFonts w:eastAsiaTheme="minorEastAsia"/>
           <w:iCs/>
+          <w:noProof/>
         </w:rPr>
         <w:drawing>
           <wp:inline distT="0" distB="0" distL="0" distR="0" wp14:anchorId="70441E92" wp14:editId="4F367DDB">
@@ -21823,10 +21830,10 @@
           <w:iCs/>
         </w:rPr>
         <w:drawing>
-          <wp:inline distT="0" distB="0" distL="0" distR="0" wp14:anchorId="053D7F96" wp14:editId="23546114">
-            <wp:extent cx="1276528" cy="1162212"/>
+          <wp:inline distT="0" distB="0" distL="0" distR="0" wp14:anchorId="5EB0D8A9" wp14:editId="4174B3FF">
+            <wp:extent cx="2495898" cy="1409897"/>
             <wp:effectExtent l="0" t="0" r="0" b="0"/>
-            <wp:docPr id="911227521" name="Imagen 1"/>
+            <wp:docPr id="1050207301" name="Imagen 1"/>
             <wp:cNvGraphicFramePr>
               <a:graphicFrameLocks xmlns:a="http://schemas.openxmlformats.org/drawingml/2006/main" noChangeAspect="1"/>
             </wp:cNvGraphicFramePr>
@@ -21834,7 +21841,7 @@
               <a:graphicData uri="http://schemas.openxmlformats.org/drawingml/2006/picture">
                 <pic:pic xmlns:pic="http://schemas.openxmlformats.org/drawingml/2006/picture">
                   <pic:nvPicPr>
-                    <pic:cNvPr id="911227521" name=""/>
+                    <pic:cNvPr id="1050207301" name=""/>
                     <pic:cNvPicPr/>
                   </pic:nvPicPr>
                   <pic:blipFill>
@@ -21846,7 +21853,7 @@
                   <pic:spPr>
                     <a:xfrm>
                       <a:off x="0" y="0"/>
-                      <a:ext cx="1276528" cy="1162212"/>
+                      <a:ext cx="2495898" cy="1409897"/>
                     </a:xfrm>
                     <a:prstGeom prst="rect">
                       <a:avLst/>
@@ -21877,6 +21884,7 @@
       <w:r>
         <w:rPr>
           <w:iCs/>
+          <w:noProof/>
         </w:rPr>
         <w:drawing>
           <wp:inline distT="0" distB="0" distL="0" distR="0" wp14:anchorId="79E581CF" wp14:editId="74B1CD6B">
@@ -21917,6 +21925,7 @@
     </w:p>
     <w:p>
       <w:pPr>
+        <w:jc w:val="center"/>
         <w:rPr>
           <w:iCs/>
         </w:rPr>
@@ -21924,12 +21933,13 @@
       <w:r>
         <w:rPr>
           <w:iCs/>
+          <w:noProof/>
         </w:rPr>
         <w:lastRenderedPageBreak/>
         <w:drawing>
-          <wp:inline distT="0" distB="0" distL="0" distR="0" wp14:anchorId="4A45DCF5" wp14:editId="38F866E1">
-            <wp:extent cx="5427023" cy="2800707"/>
-            <wp:effectExtent l="0" t="0" r="2540" b="0"/>
+          <wp:inline distT="0" distB="0" distL="0" distR="0" wp14:anchorId="4A45DCF5" wp14:editId="54C63C77">
+            <wp:extent cx="5248894" cy="2708780"/>
+            <wp:effectExtent l="0" t="0" r="0" b="0"/>
             <wp:docPr id="463672551" name="Imagen 1"/>
             <wp:cNvGraphicFramePr>
               <a:graphicFrameLocks xmlns:a="http://schemas.openxmlformats.org/drawingml/2006/main" noChangeAspect="1"/>
@@ -21950,7 +21960,7 @@
                   <pic:spPr>
                     <a:xfrm>
                       <a:off x="0" y="0"/>
-                      <a:ext cx="5432424" cy="2803494"/>
+                      <a:ext cx="5258336" cy="2713653"/>
                     </a:xfrm>
                     <a:prstGeom prst="rect">
                       <a:avLst/>
@@ -21980,11 +21990,12 @@
       <w:r>
         <w:rPr>
           <w:iCs/>
+          <w:noProof/>
         </w:rPr>
         <w:drawing>
-          <wp:inline distT="0" distB="0" distL="0" distR="0" wp14:anchorId="48036315" wp14:editId="21683052">
-            <wp:extent cx="5522026" cy="2849735"/>
-            <wp:effectExtent l="0" t="0" r="2540" b="8255"/>
+          <wp:inline distT="0" distB="0" distL="0" distR="0" wp14:anchorId="48036315" wp14:editId="00F94DFD">
+            <wp:extent cx="5284519" cy="2727165"/>
+            <wp:effectExtent l="0" t="0" r="0" b="0"/>
             <wp:docPr id="181274468" name="Imagen 1"/>
             <wp:cNvGraphicFramePr>
               <a:graphicFrameLocks xmlns:a="http://schemas.openxmlformats.org/drawingml/2006/main" noChangeAspect="1"/>
@@ -22005,7 +22016,7 @@
                   <pic:spPr>
                     <a:xfrm>
                       <a:off x="0" y="0"/>
-                      <a:ext cx="5526621" cy="2852106"/>
+                      <a:ext cx="5301109" cy="2735726"/>
                     </a:xfrm>
                     <a:prstGeom prst="rect">
                       <a:avLst/>
@@ -22063,10 +22074,10 @@
           <w:iCs/>
         </w:rPr>
         <w:drawing>
-          <wp:inline distT="0" distB="0" distL="0" distR="0" wp14:anchorId="7A18809F" wp14:editId="136126D7">
-            <wp:extent cx="1352739" cy="1162212"/>
-            <wp:effectExtent l="0" t="0" r="0" b="0"/>
-            <wp:docPr id="344146747" name="Imagen 1"/>
+          <wp:inline distT="0" distB="0" distL="0" distR="0" wp14:anchorId="501C69AD" wp14:editId="4671EC4C">
+            <wp:extent cx="2386940" cy="1348348"/>
+            <wp:effectExtent l="0" t="0" r="0" b="4445"/>
+            <wp:docPr id="393017145" name="Imagen 1"/>
             <wp:cNvGraphicFramePr>
               <a:graphicFrameLocks xmlns:a="http://schemas.openxmlformats.org/drawingml/2006/main" noChangeAspect="1"/>
             </wp:cNvGraphicFramePr>
@@ -22074,7 +22085,7 @@
               <a:graphicData uri="http://schemas.openxmlformats.org/drawingml/2006/picture">
                 <pic:pic xmlns:pic="http://schemas.openxmlformats.org/drawingml/2006/picture">
                   <pic:nvPicPr>
-                    <pic:cNvPr id="344146747" name=""/>
+                    <pic:cNvPr id="393017145" name=""/>
                     <pic:cNvPicPr/>
                   </pic:nvPicPr>
                   <pic:blipFill>
@@ -22086,7 +22097,7 @@
                   <pic:spPr>
                     <a:xfrm>
                       <a:off x="0" y="0"/>
-                      <a:ext cx="1352739" cy="1162212"/>
+                      <a:ext cx="2391772" cy="1351078"/>
                     </a:xfrm>
                     <a:prstGeom prst="rect">
                       <a:avLst/>
@@ -22117,6 +22128,7 @@
       <w:r>
         <w:rPr>
           <w:iCs/>
+          <w:noProof/>
         </w:rPr>
         <w:drawing>
           <wp:inline distT="0" distB="0" distL="0" distR="0" wp14:anchorId="3A535C30" wp14:editId="2B046286">
@@ -22173,6 +22185,7 @@
       <w:r>
         <w:rPr>
           <w:iCs/>
+          <w:noProof/>
         </w:rPr>
         <w:drawing>
           <wp:inline distT="0" distB="0" distL="0" distR="0" wp14:anchorId="6EB0937D" wp14:editId="57D0EBF2">
@@ -22414,7 +22427,7 @@
         </w:rPr>
         <w:lastRenderedPageBreak/>
         <w:drawing>
-          <wp:inline distT="0" distB="0" distL="0" distR="0" wp14:anchorId="0D3DE673" wp14:editId="6359E5E7">
+          <wp:inline distT="0" distB="0" distL="0" distR="0" wp14:anchorId="0D3DE673" wp14:editId="2BE12531">
             <wp:extent cx="5308270" cy="2197064"/>
             <wp:effectExtent l="0" t="0" r="6985" b="0"/>
             <wp:docPr id="1842219034" name="Imagen 3"/>
@@ -22753,6 +22766,9 @@
     </w:p>
     <w:p>
       <w:r>
+        <w:rPr>
+          <w:noProof/>
+        </w:rPr>
         <w:drawing>
           <wp:inline distT="0" distB="0" distL="0" distR="0" wp14:anchorId="7ABC9ABC" wp14:editId="55E73B75">
             <wp:extent cx="5612130" cy="525780"/>
@@ -24410,14 +24426,11 @@
         <w:jc w:val="center"/>
       </w:pPr>
       <w:r>
-        <w:rPr>
-          <w:noProof/>
-        </w:rPr>
         <w:drawing>
-          <wp:inline distT="0" distB="0" distL="0" distR="0" wp14:anchorId="6F305C97" wp14:editId="4DB508A8">
-            <wp:extent cx="1270635" cy="1163955"/>
-            <wp:effectExtent l="0" t="0" r="5715" b="0"/>
-            <wp:docPr id="1389815066" name="Imagen 14"/>
+          <wp:inline distT="0" distB="0" distL="0" distR="0" wp14:anchorId="28C88156" wp14:editId="2F168361">
+            <wp:extent cx="2495898" cy="1409897"/>
+            <wp:effectExtent l="0" t="0" r="0" b="0"/>
+            <wp:docPr id="649659394" name="Imagen 1"/>
             <wp:cNvGraphicFramePr>
               <a:graphicFrameLocks xmlns:a="http://schemas.openxmlformats.org/drawingml/2006/main" noChangeAspect="1"/>
             </wp:cNvGraphicFramePr>
@@ -24425,36 +24438,23 @@
               <a:graphicData uri="http://schemas.openxmlformats.org/drawingml/2006/picture">
                 <pic:pic xmlns:pic="http://schemas.openxmlformats.org/drawingml/2006/picture">
                   <pic:nvPicPr>
-                    <pic:cNvPr id="0" name="Picture 33"/>
-                    <pic:cNvPicPr>
-                      <a:picLocks noChangeAspect="1" noChangeArrowheads="1"/>
-                    </pic:cNvPicPr>
+                    <pic:cNvPr id="649659394" name=""/>
+                    <pic:cNvPicPr/>
                   </pic:nvPicPr>
                   <pic:blipFill>
-                    <a:blip r:embed="rId159">
-                      <a:extLst>
-                        <a:ext uri="{28A0092B-C50C-407E-A947-70E740481C1C}">
-                          <a14:useLocalDpi xmlns:a14="http://schemas.microsoft.com/office/drawing/2010/main" val="0"/>
-                        </a:ext>
-                      </a:extLst>
-                    </a:blip>
-                    <a:srcRect/>
+                    <a:blip r:embed="rId145"/>
                     <a:stretch>
                       <a:fillRect/>
                     </a:stretch>
                   </pic:blipFill>
-                  <pic:spPr bwMode="auto">
+                  <pic:spPr>
                     <a:xfrm>
                       <a:off x="0" y="0"/>
-                      <a:ext cx="1270635" cy="1163955"/>
+                      <a:ext cx="2495898" cy="1409897"/>
                     </a:xfrm>
                     <a:prstGeom prst="rect">
                       <a:avLst/>
                     </a:prstGeom>
-                    <a:noFill/>
-                    <a:ln>
-                      <a:noFill/>
-                    </a:ln>
                   </pic:spPr>
                 </pic:pic>
               </a:graphicData>
@@ -24468,6 +24468,9 @@
         <w:jc w:val="center"/>
       </w:pPr>
       <w:r>
+        <w:rPr>
+          <w:noProof/>
+        </w:rPr>
         <w:lastRenderedPageBreak/>
         <w:drawing>
           <wp:inline distT="0" distB="0" distL="0" distR="0" wp14:anchorId="11651D26" wp14:editId="6F1BFF5D">
@@ -24485,7 +24488,7 @@
                     <pic:cNvPicPr/>
                   </pic:nvPicPr>
                   <pic:blipFill>
-                    <a:blip r:embed="rId160"/>
+                    <a:blip r:embed="rId159"/>
                     <a:stretch>
                       <a:fillRect/>
                     </a:stretch>
@@ -24512,6 +24515,9 @@
         <w:jc w:val="center"/>
       </w:pPr>
       <w:r>
+        <w:rPr>
+          <w:noProof/>
+        </w:rPr>
         <w:drawing>
           <wp:inline distT="0" distB="0" distL="0" distR="0" wp14:anchorId="40A2D313" wp14:editId="59A1BC45">
             <wp:extent cx="5612130" cy="2910840"/>
@@ -24528,7 +24534,7 @@
                     <pic:cNvPicPr/>
                   </pic:nvPicPr>
                   <pic:blipFill>
-                    <a:blip r:embed="rId161"/>
+                    <a:blip r:embed="rId160"/>
                     <a:stretch>
                       <a:fillRect/>
                     </a:stretch>
@@ -24554,6 +24560,9 @@
         <w:jc w:val="center"/>
       </w:pPr>
       <w:r>
+        <w:rPr>
+          <w:noProof/>
+        </w:rPr>
         <w:drawing>
           <wp:inline distT="0" distB="0" distL="0" distR="0" wp14:anchorId="6F933E0D" wp14:editId="429B857D">
             <wp:extent cx="5612130" cy="2896235"/>
@@ -24570,7 +24579,7 @@
                     <pic:cNvPicPr/>
                   </pic:nvPicPr>
                   <pic:blipFill>
-                    <a:blip r:embed="rId162"/>
+                    <a:blip r:embed="rId161"/>
                     <a:stretch>
                       <a:fillRect/>
                     </a:stretch>
@@ -24610,14 +24619,11 @@
         <w:jc w:val="center"/>
       </w:pPr>
       <w:r>
-        <w:rPr>
-          <w:noProof/>
-        </w:rPr>
         <w:drawing>
-          <wp:inline distT="0" distB="0" distL="0" distR="0" wp14:anchorId="6751503D" wp14:editId="1C8824F2">
-            <wp:extent cx="1353820" cy="1163955"/>
+          <wp:inline distT="0" distB="0" distL="0" distR="0" wp14:anchorId="64334CD4" wp14:editId="1F175A07">
+            <wp:extent cx="2495898" cy="1409897"/>
             <wp:effectExtent l="0" t="0" r="0" b="0"/>
-            <wp:docPr id="798509321" name="Imagen 11"/>
+            <wp:docPr id="396419371" name="Imagen 1"/>
             <wp:cNvGraphicFramePr>
               <a:graphicFrameLocks xmlns:a="http://schemas.openxmlformats.org/drawingml/2006/main" noChangeAspect="1"/>
             </wp:cNvGraphicFramePr>
@@ -24625,36 +24631,23 @@
               <a:graphicData uri="http://schemas.openxmlformats.org/drawingml/2006/picture">
                 <pic:pic xmlns:pic="http://schemas.openxmlformats.org/drawingml/2006/picture">
                   <pic:nvPicPr>
-                    <pic:cNvPr id="0" name="Picture 27"/>
-                    <pic:cNvPicPr>
-                      <a:picLocks noChangeAspect="1" noChangeArrowheads="1"/>
-                    </pic:cNvPicPr>
+                    <pic:cNvPr id="396419371" name=""/>
+                    <pic:cNvPicPr/>
                   </pic:nvPicPr>
                   <pic:blipFill>
-                    <a:blip r:embed="rId163">
-                      <a:extLst>
-                        <a:ext uri="{28A0092B-C50C-407E-A947-70E740481C1C}">
-                          <a14:useLocalDpi xmlns:a14="http://schemas.microsoft.com/office/drawing/2010/main" val="0"/>
-                        </a:ext>
-                      </a:extLst>
-                    </a:blip>
-                    <a:srcRect/>
+                    <a:blip r:embed="rId149"/>
                     <a:stretch>
                       <a:fillRect/>
                     </a:stretch>
                   </pic:blipFill>
-                  <pic:spPr bwMode="auto">
+                  <pic:spPr>
                     <a:xfrm>
                       <a:off x="0" y="0"/>
-                      <a:ext cx="1353820" cy="1163955"/>
+                      <a:ext cx="2495898" cy="1409897"/>
                     </a:xfrm>
                     <a:prstGeom prst="rect">
                       <a:avLst/>
                     </a:prstGeom>
-                    <a:noFill/>
-                    <a:ln>
-                      <a:noFill/>
-                    </a:ln>
                   </pic:spPr>
                 </pic:pic>
               </a:graphicData>
@@ -24689,7 +24682,7 @@
                     </pic:cNvPicPr>
                   </pic:nvPicPr>
                   <pic:blipFill>
-                    <a:blip r:embed="rId164">
+                    <a:blip r:embed="rId162">
                       <a:extLst>
                         <a:ext uri="{28A0092B-C50C-407E-A947-70E740481C1C}">
                           <a14:useLocalDpi xmlns:a14="http://schemas.microsoft.com/office/drawing/2010/main" val="0"/>
@@ -24730,7 +24723,7 @@
           <w:noProof/>
         </w:rPr>
         <w:drawing>
-          <wp:inline distT="0" distB="0" distL="0" distR="0" wp14:anchorId="4B84BFFA" wp14:editId="686E1CF6">
+          <wp:inline distT="0" distB="0" distL="0" distR="0" wp14:anchorId="4B84BFFA" wp14:editId="08F4A16A">
             <wp:extent cx="5522026" cy="2269490"/>
             <wp:effectExtent l="0" t="0" r="2540" b="0"/>
             <wp:docPr id="934478524" name="Imagen 13"/>
@@ -24747,7 +24740,7 @@
                     </pic:cNvPicPr>
                   </pic:nvPicPr>
                   <pic:blipFill rotWithShape="1">
-                    <a:blip r:embed="rId165" cstate="print">
+                    <a:blip r:embed="rId163" cstate="print">
                       <a:extLst>
                         <a:ext uri="{28A0092B-C50C-407E-A947-70E740481C1C}">
                           <a14:useLocalDpi xmlns:a14="http://schemas.microsoft.com/office/drawing/2010/main" val="0"/>
@@ -24829,7 +24822,7 @@
           <w:szCs w:val="20"/>
         </w:rPr>
       </w:pPr>
-      <w:hyperlink r:id="rId166" w:history="1">
+      <w:hyperlink r:id="rId164" w:history="1">
         <w:r>
           <w:rPr>
             <w:rStyle w:val="Hipervnculo"/>
@@ -24857,6 +24850,7 @@
         <w:rPr>
           <w:rFonts w:ascii="Arial" w:hAnsi="Arial" w:cs="Arial"/>
         </w:rPr>
+        <w:lastRenderedPageBreak/>
         <w:t>Drivers</w:t>
       </w:r>
       <w:bookmarkEnd w:id="69"/>
@@ -24895,7 +24889,7 @@
         </w:rPr>
         <w:t xml:space="preserve"> to install them manually, they are available at </w:t>
       </w:r>
-      <w:hyperlink r:id="rId167" w:history="1">
+      <w:hyperlink r:id="rId165" w:history="1">
         <w:r>
           <w:rPr>
             <w:rStyle w:val="Hipervnculo"/>
@@ -24962,7 +24956,7 @@
         </w:rPr>
         <w:t xml:space="preserve">For technical support, contact us at </w:t>
       </w:r>
-      <w:hyperlink r:id="rId168" w:history="1">
+      <w:hyperlink r:id="rId166" w:history="1">
         <w:r>
           <w:rPr>
             <w:rStyle w:val="Hipervnculo"/>
@@ -25007,7 +25001,7 @@
           <w:szCs w:val="20"/>
         </w:rPr>
       </w:pPr>
-      <w:hyperlink r:id="rId169" w:history="1">
+      <w:hyperlink r:id="rId167" w:history="1">
         <w:r>
           <w:rPr>
             <w:rStyle w:val="Hipervnculo"/>
@@ -25035,7 +25029,7 @@
       </w:pPr>
     </w:p>
     <w:sectPr>
-      <w:headerReference w:type="default" r:id="rId170"/>
+      <w:headerReference w:type="default" r:id="rId168"/>
       <w:pgSz w:w="12240" w:h="15840"/>
       <w:pgMar w:top="1417" w:right="1701" w:bottom="1417" w:left="1701" w:header="708" w:footer="708" w:gutter="0"/>
       <w:cols w:space="708"/>
@@ -26666,9 +26660,11 @@
     <w:rsid w:val="00CE2C9F"/>
     <w:rsid w:val="00DC5912"/>
     <w:rsid w:val="00DC6016"/>
+    <w:rsid w:val="00E90657"/>
     <w:rsid w:val="00EB52E2"/>
     <w:rsid w:val="00F14015"/>
     <w:rsid w:val="00F962BC"/>
+    <w:rsid w:val="00FA7DF9"/>
     <w:rsid w:val="00FD0418"/>
   </w:rsids>
   <m:mathPr>

</xml_diff>